<commit_message>
Rewrite Materials and methods as continuous prose, removing 2.1-2.8 subheadings
</commit_message>
<xml_diff>
--- a/Manuscript_MOO_FlatTube_HybridNanofluid.docx
+++ b/Manuscript_MOO_FlatTube_HybridNanofluid.docx
@@ -253,14 +253,6 @@
       </w:r>
     </w:p>
     <w:p>
-      <w:pPr>
-        <w:pStyle w:val="Heading2"/>
-      </w:pPr>
-      <w:r>
-        <w:t xml:space="preserve">2.1 Flat-tube geometry and design variables</w:t>
-      </w:r>
-    </w:p>
-    <w:p>
       <w:pPr/>
       <w:r>
         <w:t xml:space="preserve">The test article is a horizontally mounted flat (rectangular-profile) tube of total length </w:t>
@@ -440,14 +432,6 @@
       </w:r>
     </w:p>
     <w:p>
-      <w:pPr>
-        <w:pStyle w:val="Heading2"/>
-      </w:pPr>
-      <w:r>
-        <w:t xml:space="preserve">2.2 Hybrid-nanofluid preparation and thermophysical properties</w:t>
-      </w:r>
-    </w:p>
-    <w:p>
       <w:pPr/>
       <w:r>
         <w:t xml:space="preserve">The working fluid is a water-based binary hybrid nanofluid of ZnO and TiO₂ nanoparticles (nominal diameter 30–50 nm, purity &gt; 99 %), selected for their complementary conductivity and the flat-tube evidence base established above. The total volume fraction is varied from 0 to 1.0 % in steps of 0.25 %, and the mixing ratio </w:t>
@@ -465,7 +449,7 @@
     <w:p>
       <w:pPr/>
       <w:r>
-        <w:t xml:space="preserve">The effective density and heat-capacity product of the hybrid suspension follow the standard mixing rules:</w:t>
+        <w:t xml:space="preserve">Consistent thermophysical properties are prerequisite for both the experiments and the numerical model. The effective density and heat-capacity product of the hybrid suspension follow the standard mixing rules:</w:t>
       </w:r>
     </w:p>
     <w:p>
@@ -866,17 +850,9 @@
       </w:r>
     </w:p>
     <w:p>
-      <w:pPr>
-        <w:pStyle w:val="Heading2"/>
-      </w:pPr>
-      <w:r>
-        <w:t xml:space="preserve">2.3 Experimental facility and procedure</w:t>
-      </w:r>
-    </w:p>
-    <w:p>
-      <w:pPr/>
-      <w:r>
-        <w:t xml:space="preserve">The closed-loop facility is shown in Figure 2. It comprises a stainless-steel reservoir fitted with a cooling coil and stirrer (temperature control ±0.2 °C), a centrifugal pump, a bypass line with a fine control valve, a calibrated rotameter (±1 % of reading), the instrumented flat-tube test section, and a differential-pressure transducer (±0.25 % of full scale) connected to wall pressure taps P1 and P2 at the start and end of the heated section. The heated zone is supplied by an adjustable DC power source through a clamped heater plate providing uniform heat flux, and the test section is wrapped in 25 mm of mineral-wool insulation. Four T-type thermocouples (±0.1 °C) measure the bulk fluid temperature at inlet and outlet (T1, T4) and the wall temperature at two axial stations (T2, T3); all signals are logged by a PC-based data-acquisition system.</w:t>
+      <w:pPr/>
+      <w:r>
+        <w:t xml:space="preserve">Thermo-hydraulic measurements are carried out on a purpose-built closed-loop facility, shown in Figure 2. It comprises a stainless-steel reservoir fitted with a cooling coil and stirrer (temperature control ±0.2 °C), a centrifugal pump, a bypass line with a fine control valve, a calibrated rotameter (±1 % of reading), the instrumented flat-tube test section, and a differential-pressure transducer (±0.25 % of full scale) connected to wall pressure taps P1 and P2 at the start and end of the heated section. The heated zone is supplied by an adjustable DC power source through a clamped heater plate providing uniform heat flux, and the test section is wrapped in 25 mm of mineral-wool insulation. Four T-type thermocouples (±0.1 °C) measure the bulk fluid temperature at inlet and outlet (T1, T4) and the wall temperature at two axial stations (T2, T3); all signals are logged by a PC-based data-acquisition system.</w:t>
       </w:r>
     </w:p>
     <w:p>
@@ -933,17 +909,9 @@
       </w:r>
     </w:p>
     <w:p>
-      <w:pPr>
-        <w:pStyle w:val="Heading2"/>
-      </w:pPr>
-      <w:r>
-        <w:t xml:space="preserve">2.4 Numerical modelling</w:t>
-      </w:r>
-    </w:p>
-    <w:p>
-      <w:pPr/>
-      <w:r>
-        <w:t xml:space="preserve">CFD simulations extend the database to the complete geometric matrix. Assuming a homogeneous single phase—justified for φ ≤ 1 %—the three-dimensional Reynolds-averaged Navier–Stokes (RANS) equations for continuity, momentum, and energy are solved with the shear-stress-transport (SST) </w:t>
+      <w:pPr/>
+      <w:r>
+        <w:t xml:space="preserve">Because only the machinable geometries can be tested experimentally, complementary CFD simulations extend the database to the complete geometric matrix. Assuming a homogeneous single phase—justified for φ ≤ 1 %—the three-dimensional Reynolds-averaged Navier–Stokes (RANS) equations for continuity, momentum, and energy are solved with the shear-stress-transport (SST) </w:t>
       </w:r>
       <w:r>
         <w:rPr>
@@ -1040,17 +1008,9 @@
       </w:r>
     </w:p>
     <w:p>
-      <w:pPr>
-        <w:pStyle w:val="Heading2"/>
-      </w:pPr>
-      <w:r>
-        <w:t xml:space="preserve">2.5 Data reduction</w:t>
-      </w:r>
-    </w:p>
-    <w:p>
-      <w:pPr/>
-      <w:r>
-        <w:t xml:space="preserve">The electrical heat input and the fluid-side absorbed heat are</w:t>
+      <w:pPr/>
+      <w:r>
+        <w:t xml:space="preserve">Both the experimental and numerical records are reduced to a common set of thermo-hydraulic quantities. The electrical heat input and the fluid-side absorbed heat are</w:t>
       </w:r>
     </w:p>
     <w:p>
@@ -1367,17 +1327,9 @@
       </w:r>
     </w:p>
     <w:p>
-      <w:pPr>
-        <w:pStyle w:val="Heading2"/>
-      </w:pPr>
-      <w:r>
-        <w:t xml:space="preserve">2.6 Machine-learning surrogate models</w:t>
-      </w:r>
-    </w:p>
-    <w:p>
-      <w:pPr/>
-      <w:r>
-        <w:t xml:space="preserve">After min–max normalization, the merged experimental–numerical database, mapping </w:t>
+      <w:pPr/>
+      <w:r>
+        <w:t xml:space="preserve">The reduced records form the training corpus for the surrogate models. After min–max normalization, the merged experimental–numerical database, mapping </w:t>
       </w:r>
       <w:r>
         <w:rPr>
@@ -1647,17 +1599,9 @@
       </w:r>
     </w:p>
     <w:p>
-      <w:pPr>
-        <w:pStyle w:val="Heading2"/>
-      </w:pPr>
-      <w:r>
-        <w:t xml:space="preserve">2.7 Multi-objective optimization and decision-making</w:t>
-      </w:r>
-    </w:p>
-    <w:p>
-      <w:pPr/>
-      <w:r>
-        <w:t xml:space="preserve">The coupled geometry–fluid design is cast as a bi-objective problem,</w:t>
+      <w:pPr/>
+      <w:r>
+        <w:t xml:space="preserve">With the validated surrogate serving as the objective evaluator, the coupled geometry–fluid design is cast as a bi-objective problem,</w:t>
       </w:r>
     </w:p>
     <w:p>
@@ -1740,17 +1684,9 @@
       </w:r>
     </w:p>
     <w:p>
-      <w:pPr>
-        <w:pStyle w:val="Heading2"/>
-      </w:pPr>
-      <w:r>
-        <w:t xml:space="preserve">2.8 Validation and uncertainty analysis</w:t>
-      </w:r>
-    </w:p>
-    <w:p>
-      <w:pPr/>
-      <w:r>
-        <w:t xml:space="preserve">The framework is validated in two stages: (i) surrogate predictions at 20 held-out database points, and (ii) comparison of the NSGA-II optimal design against a purpose-built confirmation experiment and CFD run, requiring agreement within 5 % for </w:t>
+      <w:pPr/>
+      <w:r>
+        <w:t xml:space="preserve">Finally, the framework is validated in two stages: (i) surrogate predictions at 20 held-out database points, and (ii) comparison of the NSGA-II optimal design against a purpose-built confirmation experiment and CFD run, requiring agreement within 5 % for </w:t>
       </w:r>
       <w:r>
         <w:rPr>

</xml_diff>